<commit_message>
Logo transparent, Architektur neu, TrailerConnect raus, TISAX rein
DOCX & alle 3 MD-Versionen überarbeitet:
- Logo: schwarzer Hintergrund → transparent/weiß
- Marktanteile-Chart entfernt
- Telematik-Wachstum-Chart (Einheiten) entfernt
- Architektur-Diagramm komplett neu: professionell, 3-Layer,
  NeoGeo CI, kein TrailerConnect
- TrailerConnect® überall entfernt (DOCX + alle 3 MDs + LinkedIn + Pitch)
- TISAX Stufe 3 (AL 3) ergänzt: Deckblatt, Seite 2, Tech-Stack,
  Über uns, alle LinkedIn-Nachrichten, alle Pitch-Slides
- Neues generate_assets.py für Logo-Fix und Architektur-Diagramm

https://claude.ai/code/session_019qXvF8jHAEBewhUUDuPjkS
</commit_message>
<xml_diff>
--- a/docs/scb_telematics_referenz.docx
+++ b/docs/scb_telematics_referenz.docx
@@ -238,6 +238,28 @@
           <w:color w:val="757575"/>
           <w:sz w:val="22"/>
         </w:rPr>
+        <w:t xml:space="preserve">Zertifizierung: </w:t>
+      </w:r>
+      <w:r>
+        <w:rPr>
+          <w:rFonts w:ascii="Segoe UI" w:hAnsi="Segoe UI"/>
+          <w:color w:val="757575"/>
+          <w:sz w:val="22"/>
+        </w:rPr>
+        <w:t>TISAX Stufe 3 (AL 3) — höchste Sicherheitsstufe</w:t>
+      </w:r>
+    </w:p>
+    <w:p>
+      <w:pPr>
+        <w:jc w:val="center"/>
+      </w:pPr>
+      <w:r>
+        <w:rPr>
+          <w:rFonts w:ascii="Segoe UI" w:hAnsi="Segoe UI"/>
+          <w:b/>
+          <w:color w:val="757575"/>
+          <w:sz w:val="22"/>
+        </w:rPr>
         <w:t xml:space="preserve">Auszeichnung: </w:t>
       </w:r>
       <w:r>
@@ -328,7 +350,180 @@
           <w:color w:val="212121"/>
           <w:sz w:val="36"/>
         </w:rPr>
-        <w:t>1. Projektübersicht</w:t>
+        <w:t>1. Wer wir sind</w:t>
+      </w:r>
+    </w:p>
+    <w:tbl>
+      <w:tblPr>
+        <w:tblW w:type="auto" w:w="0"/>
+        <w:jc w:val="left"/>
+        <w:tblLook w:firstColumn="1" w:firstRow="1" w:lastColumn="0" w:lastRow="0" w:noHBand="0" w:noVBand="1" w:val="04A0"/>
+        <w:tblBorders>
+          <w:top w:val="none" w:sz="0" w:space="0" w:color="auto"/>
+          <w:left w:val="none" w:sz="0" w:space="0" w:color="auto"/>
+          <w:bottom w:val="none" w:sz="0" w:space="0" w:color="auto"/>
+          <w:right w:val="none" w:sz="0" w:space="0" w:color="auto"/>
+          <w:insideH w:val="none" w:sz="0" w:space="0" w:color="auto"/>
+          <w:insideV w:val="none" w:sz="0" w:space="0" w:color="auto"/>
+        </w:tblBorders>
+      </w:tblPr>
+      <w:tblGrid>
+        <w:gridCol w:w="9406"/>
+      </w:tblGrid>
+      <w:tr>
+        <w:trPr>
+          <w:trHeight w:val="50" w:hRule="exact"/>
+        </w:trPr>
+        <w:tc>
+          <w:tcPr>
+            <w:tcW w:type="dxa" w:w="3969"/>
+            <w:shd w:fill="E67E22" w:val="clear"/>
+          </w:tcPr>
+          <w:p>
+            <w:r/>
+          </w:p>
+        </w:tc>
+      </w:tr>
+    </w:tbl>
+    <w:p>
+      <w:r>
+        <w:rPr>
+          <w:rFonts w:ascii="Segoe UI" w:hAnsi="Segoe UI"/>
+          <w:color w:val="424242"/>
+          <w:sz w:val="22"/>
+        </w:rPr>
+        <w:t>NeoGeo New Media GmbH ist ein deutsches Software-Engineering-Team mit über 30 Jahren Erfahrung in der Entwicklung anspruchsvoller Softwaresysteme. Wir arbeiten seit Jahrzehnten mit namhaften Kunden aus Industrie, Logistik und Technologie — mit einem nachweislichen Track Record bei der Umsetzung komplexer Plattformprojekte.</w:t>
+      </w:r>
+    </w:p>
+    <w:tbl>
+      <w:tblPr>
+        <w:tblW w:type="auto" w:w="0"/>
+        <w:jc w:val="left"/>
+        <w:tblLook w:firstColumn="1" w:firstRow="1" w:lastColumn="0" w:lastRow="0" w:noHBand="0" w:noVBand="1" w:val="04A0"/>
+        <w:tblBorders>
+          <w:top w:val="none" w:sz="0" w:space="0" w:color="auto"/>
+          <w:left w:val="none" w:sz="0" w:space="0" w:color="auto"/>
+          <w:bottom w:val="none" w:sz="0" w:space="0" w:color="auto"/>
+          <w:right w:val="none" w:sz="0" w:space="0" w:color="auto"/>
+          <w:insideH w:val="none" w:sz="0" w:space="0" w:color="auto"/>
+          <w:insideV w:val="none" w:sz="0" w:space="0" w:color="auto"/>
+        </w:tblBorders>
+      </w:tblPr>
+      <w:tblGrid>
+        <w:gridCol w:w="9406"/>
+      </w:tblGrid>
+      <w:tr>
+        <w:tc>
+          <w:tcPr>
+            <w:tcW w:type="dxa" w:w="9406"/>
+            <w:shd w:fill="FEF5ED" w:val="clear"/>
+            <w:tcBorders>
+              <w:top w:val="none" w:sz="0" w:space="0" w:color="auto"/>
+              <w:left w:val="single" w:sz="24" w:space="0" w:color="E67E22"/>
+              <w:bottom w:val="none" w:sz="0" w:space="0" w:color="auto"/>
+              <w:right w:val="none" w:sz="0" w:space="0" w:color="auto"/>
+            </w:tcBorders>
+          </w:tcPr>
+          <w:p>
+            <w:r>
+              <w:rPr>
+                <w:rFonts w:ascii="Segoe UI" w:hAnsi="Segoe UI"/>
+                <w:color w:val="424242"/>
+                <w:sz w:val="22"/>
+              </w:rPr>
+              <w:t>TISAX Stufe 3 (AL 3) zertifiziert — höchste Sicherheitsstufe für Informationssicherheit in der Automobilindustrie. Wir erfüllen die strengsten Anforderungen an Datenschutz, IT-Sicherheit und Vertraulichkeit.</w:t>
+            </w:r>
+          </w:p>
+        </w:tc>
+      </w:tr>
+    </w:tbl>
+    <w:p>
+      <w:r>
+        <w:rPr>
+          <w:rFonts w:ascii="Segoe UI" w:hAnsi="Segoe UI"/>
+          <w:b/>
+          <w:color w:val="E67E22"/>
+          <w:sz w:val="28"/>
+        </w:rPr>
+        <w:t>Skalierbar und kosteneffizient</w:t>
+      </w:r>
+    </w:p>
+    <w:p>
+      <w:r>
+        <w:rPr>
+          <w:rFonts w:ascii="Segoe UI" w:hAnsi="Segoe UI"/>
+          <w:color w:val="424242"/>
+          <w:sz w:val="22"/>
+        </w:rPr>
+        <w:t>Über unser etabliertes Nearshoring-Modell können wir Projektteams flexibel und kontrolliert skalieren — im europäischen Ausland und darüber hinaus.</w:t>
+      </w:r>
+    </w:p>
+    <w:p>
+      <w:pPr>
+        <w:pStyle w:val="ListBullet"/>
+      </w:pPr>
+      <w:r>
+        <w:rPr>
+          <w:rFonts w:ascii="Segoe UI" w:hAnsi="Segoe UI"/>
+          <w:color w:val="424242"/>
+          <w:sz w:val="22"/>
+        </w:rPr>
+        <w:t>Engineering und Steuerung in Deutschland — Architektur, Qualitätssicherung, Projektleitung</w:t>
+      </w:r>
+    </w:p>
+    <w:p>
+      <w:pPr>
+        <w:pStyle w:val="ListBullet"/>
+      </w:pPr>
+      <w:r>
+        <w:rPr>
+          <w:rFonts w:ascii="Segoe UI" w:hAnsi="Segoe UI"/>
+          <w:color w:val="424242"/>
+          <w:sz w:val="22"/>
+        </w:rPr>
+        <w:t>Kontrollierte Skalierung über Nearshoring — erprobte Teams in Europa</w:t>
+      </w:r>
+    </w:p>
+    <w:p>
+      <w:pPr>
+        <w:pStyle w:val="ListBullet"/>
+      </w:pPr>
+      <w:r>
+        <w:rPr>
+          <w:rFonts w:ascii="Segoe UI" w:hAnsi="Segoe UI"/>
+          <w:color w:val="424242"/>
+          <w:sz w:val="22"/>
+        </w:rPr>
+        <w:t>Kosten im Griff — Enterprise-Qualität ohne Enterprise-Preise</w:t>
+      </w:r>
+    </w:p>
+    <w:p>
+      <w:pPr>
+        <w:pStyle w:val="ListBullet"/>
+      </w:pPr>
+      <w:r>
+        <w:rPr>
+          <w:rFonts w:ascii="Segoe UI" w:hAnsi="Segoe UI"/>
+          <w:color w:val="424242"/>
+          <w:sz w:val="22"/>
+        </w:rPr>
+        <w:t>Kein Kontrollverlust — durchgängige deutsche Projektverantwortung</w:t>
+      </w:r>
+    </w:p>
+    <w:p>
+      <w:r>
+        <w:br w:type="page"/>
+      </w:r>
+    </w:p>
+    <w:p>
+      <w:r>
+        <w:rPr>
+          <w:rFonts w:ascii="Segoe UI" w:hAnsi="Segoe UI"/>
+          <w:b/>
+          <w:color w:val="212121"/>
+          <w:sz w:val="36"/>
+        </w:rPr>
+        <w:t>2. Projektübersicht</w:t>
       </w:r>
     </w:p>
     <w:tbl>
@@ -521,45 +716,6 @@
         <w:t>Digitalisierung der gesamten Trailer-Flotte als Kernstrategie</w:t>
       </w:r>
     </w:p>
-    <w:p>
-      <w:pPr>
-        <w:jc w:val="center"/>
-      </w:pPr>
-      <w:r>
-        <w:drawing>
-          <wp:inline xmlns:a="http://schemas.openxmlformats.org/drawingml/2006/main" xmlns:pic="http://schemas.openxmlformats.org/drawingml/2006/picture">
-            <wp:extent cx="5400000" cy="4989130"/>
-            <wp:docPr id="2" name="Picture 2"/>
-            <wp:cNvGraphicFramePr>
-              <a:graphicFrameLocks noChangeAspect="1"/>
-            </wp:cNvGraphicFramePr>
-            <a:graphic>
-              <a:graphicData uri="http://schemas.openxmlformats.org/drawingml/2006/picture">
-                <pic:pic>
-                  <pic:nvPicPr>
-                    <pic:cNvPr id="0" name="chart_marktanteil.png"/>
-                    <pic:cNvPicPr/>
-                  </pic:nvPicPr>
-                  <pic:blipFill>
-                    <a:blip r:embed="rId12"/>
-                    <a:stretch>
-                      <a:fillRect/>
-                    </a:stretch>
-                  </pic:blipFill>
-                  <pic:spPr>
-                    <a:xfrm>
-                      <a:off x="0" y="0"/>
-                      <a:ext cx="5400000" cy="4989130"/>
-                    </a:xfrm>
-                    <a:prstGeom prst="rect"/>
-                  </pic:spPr>
-                </pic:pic>
-              </a:graphicData>
-            </a:graphic>
-          </wp:inline>
-        </w:drawing>
-      </w:r>
-    </w:p>
     <w:tbl>
       <w:tblPr>
         <w:tblW w:type="auto" w:w="0"/>
@@ -615,7 +771,7 @@
           <w:color w:val="212121"/>
           <w:sz w:val="36"/>
         </w:rPr>
-        <w:t>2. Unsere Rolle &amp; Leistungen</w:t>
+        <w:t>3. Unsere Rolle &amp; Leistungen</w:t>
       </w:r>
     </w:p>
     <w:tbl>
@@ -839,45 +995,6 @@
       </w:r>
     </w:p>
     <w:p>
-      <w:pPr>
-        <w:jc w:val="center"/>
-      </w:pPr>
-      <w:r>
-        <w:drawing>
-          <wp:inline xmlns:a="http://schemas.openxmlformats.org/drawingml/2006/main" xmlns:pic="http://schemas.openxmlformats.org/drawingml/2006/picture">
-            <wp:extent cx="5400000" cy="2900000"/>
-            <wp:docPr id="3" name="Picture 3"/>
-            <wp:cNvGraphicFramePr>
-              <a:graphicFrameLocks noChangeAspect="1"/>
-            </wp:cNvGraphicFramePr>
-            <a:graphic>
-              <a:graphicData uri="http://schemas.openxmlformats.org/drawingml/2006/picture">
-                <pic:pic>
-                  <pic:nvPicPr>
-                    <pic:cNvPr id="0" name="chart_telematik_wachstum.png"/>
-                    <pic:cNvPicPr/>
-                  </pic:nvPicPr>
-                  <pic:blipFill>
-                    <a:blip r:embed="rId13"/>
-                    <a:stretch>
-                      <a:fillRect/>
-                    </a:stretch>
-                  </pic:blipFill>
-                  <pic:spPr>
-                    <a:xfrm>
-                      <a:off x="0" y="0"/>
-                      <a:ext cx="5400000" cy="2900000"/>
-                    </a:xfrm>
-                    <a:prstGeom prst="rect"/>
-                  </pic:spPr>
-                </pic:pic>
-              </a:graphicData>
-            </a:graphic>
-          </wp:inline>
-        </w:drawing>
-      </w:r>
-    </w:p>
-    <w:p>
       <w:r>
         <w:br w:type="page"/>
       </w:r>
@@ -890,7 +1007,7 @@
           <w:color w:val="212121"/>
           <w:sz w:val="36"/>
         </w:rPr>
-        <w:t>3. Technische Architektur</w:t>
+        <w:t>4. Technische Architektur</w:t>
       </w:r>
     </w:p>
     <w:tbl>
@@ -932,8 +1049,8 @@
       <w:r>
         <w:drawing>
           <wp:inline xmlns:a="http://schemas.openxmlformats.org/drawingml/2006/main" xmlns:pic="http://schemas.openxmlformats.org/drawingml/2006/picture">
-            <wp:extent cx="5760000" cy="3274636"/>
-            <wp:docPr id="4" name="Picture 4"/>
+            <wp:extent cx="5760000" cy="3295818"/>
+            <wp:docPr id="2" name="Picture 2"/>
             <wp:cNvGraphicFramePr>
               <a:graphicFrameLocks noChangeAspect="1"/>
             </wp:cNvGraphicFramePr>
@@ -945,7 +1062,7 @@
                     <pic:cNvPicPr/>
                   </pic:nvPicPr>
                   <pic:blipFill>
-                    <a:blip r:embed="rId14"/>
+                    <a:blip r:embed="rId12"/>
                     <a:stretch>
                       <a:fillRect/>
                     </a:stretch>
@@ -953,7 +1070,7 @@
                   <pic:spPr>
                     <a:xfrm>
                       <a:off x="0" y="0"/>
-                      <a:ext cx="5760000" cy="3274636"/>
+                      <a:ext cx="5760000" cy="3295818"/>
                     </a:xfrm>
                     <a:prstGeom prst="rect"/>
                   </pic:spPr>
@@ -1166,7 +1283,7 @@
           <w:color w:val="212121"/>
           <w:sz w:val="36"/>
         </w:rPr>
-        <w:t>4. Ergebnisse &amp; Business Impact</w:t>
+        <w:t>5. Ergebnisse &amp; Business Impact</w:t>
       </w:r>
     </w:p>
     <w:tbl>
@@ -1390,7 +1507,7 @@
           <w:color w:val="212121"/>
           <w:sz w:val="36"/>
         </w:rPr>
-        <w:t>5. Technologie-Stack</w:t>
+        <w:t>6. Technologie-Stack</w:t>
       </w:r>
     </w:p>
     <w:tbl>
@@ -1559,7 +1676,7 @@
           <w:color w:val="424242"/>
           <w:sz w:val="22"/>
         </w:rPr>
-        <w:t>Webportal für Flottenmanagement (FleetTrack, FleetWatch)</w:t>
+        <w:t>Webportal für Flottenmanagement und Datenanalyse</w:t>
       </w:r>
     </w:p>
     <w:p>
@@ -1653,6 +1770,56 @@
     </w:p>
     <w:p>
       <w:r>
+        <w:rPr>
+          <w:rFonts w:ascii="Segoe UI" w:hAnsi="Segoe UI"/>
+          <w:b/>
+          <w:color w:val="E67E22"/>
+          <w:sz w:val="28"/>
+        </w:rPr>
+        <w:t>Zertifizierungen &amp; Sicherheit</w:t>
+      </w:r>
+    </w:p>
+    <w:p>
+      <w:pPr>
+        <w:pStyle w:val="ListBullet"/>
+      </w:pPr>
+      <w:r>
+        <w:rPr>
+          <w:rFonts w:ascii="Segoe UI" w:hAnsi="Segoe UI"/>
+          <w:color w:val="424242"/>
+          <w:sz w:val="22"/>
+        </w:rPr>
+        <w:t>TISAX Stufe 3 (AL 3) — höchste Sicherheitsstufe Automobilindustrie</w:t>
+      </w:r>
+    </w:p>
+    <w:p>
+      <w:pPr>
+        <w:pStyle w:val="ListBullet"/>
+      </w:pPr>
+      <w:r>
+        <w:rPr>
+          <w:rFonts w:ascii="Segoe UI" w:hAnsi="Segoe UI"/>
+          <w:color w:val="424242"/>
+          <w:sz w:val="22"/>
+        </w:rPr>
+        <w:t>Zero Trust Security Architecture</w:t>
+      </w:r>
+    </w:p>
+    <w:p>
+      <w:pPr>
+        <w:pStyle w:val="ListBullet"/>
+      </w:pPr>
+      <w:r>
+        <w:rPr>
+          <w:rFonts w:ascii="Segoe UI" w:hAnsi="Segoe UI"/>
+          <w:color w:val="424242"/>
+          <w:sz w:val="22"/>
+        </w:rPr>
+        <w:t>DSGVO-konforme Datenverarbeitung</w:t>
+      </w:r>
+    </w:p>
+    <w:p>
+      <w:r>
         <w:br w:type="page"/>
       </w:r>
     </w:p>
@@ -1664,7 +1831,7 @@
           <w:color w:val="212121"/>
           <w:sz w:val="36"/>
         </w:rPr>
-        <w:t>6. Über NeoGeo New Media GmbH</w:t>
+        <w:t>7. Über NeoGeo New Media GmbH</w:t>
       </w:r>
     </w:p>
     <w:tbl>
@@ -1706,7 +1873,17 @@
           <w:color w:val="424242"/>
           <w:sz w:val="22"/>
         </w:rPr>
-        <w:t>NeoGeo New Media GmbH ist ein Technologie-Unternehmen mit Sitz in Elmshorn. Wir sind spezialisiert auf die Entwicklung von IoT-Plattformen, Cloud-native Architekturen und datengetriebenen Applikationen für die Industrie und Logistik.</w:t>
+        <w:t>NeoGeo New Media GmbH ist ein deutsches Software-Engineering-Unternehmen mit Sitz in Elmshorn und über 30 Jahren Erfahrung. Wir sind spezialisiert auf die Entwicklung von IoT-Plattformen, Cloud-native Architekturen und datengetriebenen Applikationen für die Industrie und Logistik.</w:t>
+      </w:r>
+    </w:p>
+    <w:p>
+      <w:r>
+        <w:rPr>
+          <w:rFonts w:ascii="Segoe UI" w:hAnsi="Segoe UI"/>
+          <w:color w:val="424242"/>
+          <w:sz w:val="22"/>
+        </w:rPr>
+        <w:t>Wir sind TISAX Stufe 3 (AL 3) zertifiziert — die höchste Sicherheitsstufe für Informationssicherheit in der Automobilindustrie. Über unser Nearshoring-Modell skalieren wir schnell und kosteneffizient: Engineering in Deutschland, kontrollierte Skalierung im europäischen Ausland und darüber hinaus.</w:t>
       </w:r>
     </w:p>
     <w:p>
@@ -1806,7 +1983,7 @@
           <w:color w:val="212121"/>
           <w:sz w:val="36"/>
         </w:rPr>
-        <w:t>7. Kontakt</w:t>
+        <w:t>8. Kontakt</w:t>
       </w:r>
     </w:p>
     <w:tbl>
@@ -1976,19 +2153,6 @@
         <w:t>Marktdaten Trailer-Industrie: öffentliche Branchenberichte und Fachpresse</w:t>
       </w:r>
     </w:p>
-    <w:p>
-      <w:pPr>
-        <w:pStyle w:val="ListBullet"/>
-      </w:pPr>
-      <w:r>
-        <w:rPr>
-          <w:rFonts w:ascii="Segoe UI" w:hAnsi="Segoe UI"/>
-          <w:color w:val="424242"/>
-          <w:sz w:val="22"/>
-        </w:rPr>
-        <w:t>Technologie-Partner: öffentliche Produktseiten und Pressemitteilungen</w:t>
-      </w:r>
-    </w:p>
     <w:p/>
     <w:p>
       <w:r>
@@ -1998,7 +2162,7 @@
           <w:color w:val="757575"/>
           <w:sz w:val="18"/>
         </w:rPr>
-        <w:t>Hinweis: Dieses Dokument beschreibt unsere Rolle als Entwicklungspartner auf Basis öffentlich zugänglicher Informationen. Es werden keine vertraulichen oder NDA-geschützten Informationen weitergegeben. Die Zusammenarbeit ist durch den Cloud Native Rockstars Award 2022 öffentlich dokumentiert. Genannte Marken sind Eigentum ihrer jeweiligen Inhaber.</w:t>
+        <w:t>Hinweis: Dieses Dokument beschreibt unsere Rolle als Entwicklungspartner auf Basis öffentlich zugänglicher Informationen. Es werden keine vertraulichen oder NDA-geschützten Informationen weitergegeben. Die Zusammenarbeit ist durch den Cloud Native Rockstars Award 2022 öffentlich dokumentiert.</w:t>
       </w:r>
     </w:p>
     <w:sectPr>

</xml_diff>

<commit_message>
Rolle deutlicher: alleiniger Entwicklungspartner, 100% Eigenleistung
Überall von "führender/zentraler Entwicklungspartner" und
"maßgeblich mitentwickelt" auf "alleiniger Entwicklungspartner"
und "zu 100% selbst entwickelt und betrieben" geändert:
- DOCX Projektübersicht + Rolle & Leistungen
- Alle 3 MD-Versionen (Überblick, Leistungen, Nearshoring)
- Alle LinkedIn-Nachrichten (Version A, B, C)
- Alle Pitch-Slides

https://claude.ai/code/session_019qXvF8jHAEBewhUUDuPjkS
</commit_message>
<xml_diff>
--- a/docs/scb_telematics_referenz.docx
+++ b/docs/scb_telematics_referenz.docx
@@ -565,7 +565,7 @@
           <w:color w:val="424242"/>
           <w:sz w:val="22"/>
         </w:rPr>
-        <w:t>Als führender Entwicklungspartner haben wir für einen der größten europäischen Trailer-Hersteller eine cloud-native IoT-Telematik-Plattform maßgeblich mitentwickelt. Die Plattform vernetzt Trailer europaweit und bildet das Rückgrat der Digitalisierungsstrategie des Kunden.</w:t>
+        <w:t>Wir haben für einen der größten europäischen Trailer-Hersteller die komplette IoT-Telematik-Plattform entwickelt und betrieben — als alleiniger Entwicklungspartner. Architektur, Implementierung und Betrieb lagen zu 100% bei uns, natürlich in enger Abstimmung mit dem Kunden. Die Plattform vernetzt Trailer europaweit und bildet das Rückgrat seiner Digitalisierungsstrategie.</w:t>
       </w:r>
     </w:p>
     <w:tbl>
@@ -813,7 +813,7 @@
           <w:color w:val="424242"/>
           <w:sz w:val="22"/>
         </w:rPr>
-        <w:t>NeoGeo war als führender Entwicklungspartner verantwortlich für zentrale Teile der Plattform — von der Architektur über die Implementierung bis zum Betrieb. Die Zusammenarbeit umfasst mehrere Jahre und ist durch den gemeinsam gewonnenen Cloud Native Rockstars Award 2022 öffentlich dokumentiert.</w:t>
+        <w:t>NeoGeo war der alleinige Entwicklungspartner für die gesamte Plattform — von der Architektur über die Implementierung bis zum laufenden Betrieb. Alle Entwicklungsschritte lagen zu 100% bei uns, in enger Abstimmung mit dem Kunden. Die Zusammenarbeit umfasst mehrere Jahre und ist durch den gemeinsam gewonnenen Cloud Native Rockstars Award 2022 öffentlich dokumentiert.</w:t>
       </w:r>
     </w:p>
     <w:p>

</xml_diff>